<commit_message>
Fixed huge bugs with disjointed schema of the exisitng model, which resulted in the template.docx now being parsed properly.
</commit_message>
<xml_diff>
--- a/template.docx
+++ b/template.docx
@@ -838,17 +838,25 @@
         <mc:AlternateContent>
           <mc:Choice Requires="wps">
             <w:drawing>
-              <wp:anchor distT="0" distB="0" distL="114300" distR="114300" simplePos="0" relativeHeight="251670528" behindDoc="0" locked="0" layoutInCell="1" allowOverlap="1" wp14:anchorId="796ACC2D" wp14:editId="03F908B9">
+              <wp:anchor distT="0" distB="0" distL="114300" distR="114300" simplePos="0" relativeHeight="251670528" behindDoc="1" locked="0" layoutInCell="1" allowOverlap="1" wp14:anchorId="796ACC2D" wp14:editId="785F007F">
                 <wp:simplePos x="0" y="0"/>
                 <wp:positionH relativeFrom="column">
-                  <wp:posOffset>-213995</wp:posOffset>
+                  <wp:posOffset>-218440</wp:posOffset>
                 </wp:positionH>
                 <wp:positionV relativeFrom="paragraph">
-                  <wp:posOffset>273050</wp:posOffset>
+                  <wp:posOffset>270510</wp:posOffset>
                 </wp:positionV>
                 <wp:extent cx="6032500" cy="308610"/>
                 <wp:effectExtent l="0" t="0" r="25400" b="15240"/>
-                <wp:wrapSquare wrapText="bothSides"/>
+                <wp:wrapTight wrapText="bothSides">
+                  <wp:wrapPolygon edited="0">
+                    <wp:start x="0" y="0"/>
+                    <wp:lineTo x="0" y="21333"/>
+                    <wp:lineTo x="21623" y="21333"/>
+                    <wp:lineTo x="21623" y="0"/>
+                    <wp:lineTo x="0" y="0"/>
+                  </wp:wrapPolygon>
+                </wp:wrapTight>
                 <wp:docPr id="1551008561" name="Rectangle 1551008561"/>
                 <wp:cNvGraphicFramePr/>
                 <a:graphic xmlns:a="http://schemas.openxmlformats.org/drawingml/2006/main">
@@ -959,7 +967,7 @@
           </mc:Choice>
           <mc:Fallback>
             <w:pict>
-              <v:rect w14:anchorId="796ACC2D" id="Rectangle 1551008561" o:spid="_x0000_s1026" style="position:absolute;left:0;text-align:left;margin-left:-16.85pt;margin-top:21.5pt;width:475pt;height:24.3pt;z-index:251670528;visibility:visible;mso-wrap-style:square;mso-width-percent:0;mso-wrap-distance-left:9pt;mso-wrap-distance-top:0;mso-wrap-distance-right:9pt;mso-wrap-distance-bottom:0;mso-position-horizontal:absolute;mso-position-horizontal-relative:text;mso-position-vertical:absolute;mso-position-vertical-relative:text;mso-width-percent:0;mso-width-relative:margin;v-text-anchor:middle" o:gfxdata="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" fillcolor="white [3201]" strokecolor="black [3200]" strokeweight="1pt">
+              <v:rect w14:anchorId="796ACC2D" id="Rectangle 1551008561" o:spid="_x0000_s1026" style="position:absolute;left:0;text-align:left;margin-left:-17.2pt;margin-top:21.3pt;width:475pt;height:24.3pt;z-index:-251645952;visibility:visible;mso-wrap-style:square;mso-width-percent:0;mso-wrap-distance-left:9pt;mso-wrap-distance-top:0;mso-wrap-distance-right:9pt;mso-wrap-distance-bottom:0;mso-position-horizontal:absolute;mso-position-horizontal-relative:text;mso-position-vertical:absolute;mso-position-vertical-relative:text;mso-width-percent:0;mso-width-relative:margin;v-text-anchor:middle" o:gfxdata="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" fillcolor="white [3201]" strokecolor="black [3200]" strokeweight="1pt">
                 <v:stroke startarrowwidth="narrow" startarrowlength="short" endarrowwidth="narrow" endarrowlength="short" miterlimit="5243f"/>
                 <v:textbox inset="2.53958mm,1.2694mm,2.53958mm,1.2694mm">
                   <w:txbxContent>
@@ -1030,7 +1038,7 @@
                     </w:p>
                   </w:txbxContent>
                 </v:textbox>
-                <w10:wrap type="square"/>
+                <w10:wrap type="tight"/>
               </v:rect>
             </w:pict>
           </mc:Fallback>
@@ -1200,22 +1208,22 @@
       </w:pPr>
       <w:r>
         <w:rPr>
+          <w:rFonts w:ascii="Times New Roman" w:eastAsia="Times New Roman" w:hAnsi="Times New Roman" w:cs="Times New Roman"/>
+          <w:b/>
+          <w:bCs/>
+        </w:rPr>
+        <w:t xml:space="preserve">Degree:  </w:t>
+      </w:r>
+      <w:r>
+        <w:rPr>
           <w:noProof/>
         </w:rPr>
         <mc:AlternateContent>
           <mc:Choice Requires="wps">
             <w:drawing>
-              <wp:anchor distT="0" distB="0" distL="114300" distR="114300" simplePos="0" relativeHeight="251668480" behindDoc="0" locked="0" layoutInCell="1" allowOverlap="1" wp14:anchorId="30FB8FAB" wp14:editId="12962751">
-                <wp:simplePos x="0" y="0"/>
-                <wp:positionH relativeFrom="column">
-                  <wp:posOffset>462280</wp:posOffset>
-                </wp:positionH>
-                <wp:positionV relativeFrom="paragraph">
-                  <wp:posOffset>7983</wp:posOffset>
-                </wp:positionV>
+              <wp:inline distT="0" distB="0" distL="0" distR="0" wp14:anchorId="2AA1E57E" wp14:editId="1FEDD05E">
                 <wp:extent cx="1781175" cy="308610"/>
                 <wp:effectExtent l="0" t="0" r="28575" b="15240"/>
-                <wp:wrapSquare wrapText="bothSides"/>
                 <wp:docPr id="969982096" name="Rectangle 969982096"/>
                 <wp:cNvGraphicFramePr/>
                 <a:graphic xmlns:a="http://schemas.openxmlformats.org/drawingml/2006/main">
@@ -1318,12 +1326,12 @@
                     </wps:wsp>
                   </a:graphicData>
                 </a:graphic>
-              </wp:anchor>
+              </wp:inline>
             </w:drawing>
           </mc:Choice>
           <mc:Fallback>
             <w:pict>
-              <v:rect w14:anchorId="30FB8FAB" id="Rectangle 969982096" o:spid="_x0000_s1027" style="position:absolute;left:0;text-align:left;margin-left:36.4pt;margin-top:.65pt;width:140.25pt;height:24.3pt;z-index:251668480;visibility:visible;mso-wrap-style:square;mso-wrap-distance-left:9pt;mso-wrap-distance-top:0;mso-wrap-distance-right:9pt;mso-wrap-distance-bottom:0;mso-position-horizontal:absolute;mso-position-horizontal-relative:text;mso-position-vertical:absolute;mso-position-vertical-relative:text;v-text-anchor:middle" o:gfxdata="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" fillcolor="white [3201]" strokecolor="black [3200]" strokeweight="1pt">
+              <v:rect w14:anchorId="2AA1E57E" id="Rectangle 969982096" o:spid="_x0000_s1027" style="width:140.25pt;height:24.3pt;visibility:visible;mso-wrap-style:square;mso-left-percent:-10001;mso-top-percent:-10001;mso-position-horizontal:absolute;mso-position-horizontal-relative:char;mso-position-vertical:absolute;mso-position-vertical-relative:line;mso-left-percent:-10001;mso-top-percent:-10001;v-text-anchor:middle" o:gfxdata="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" fillcolor="white [3201]" strokecolor="black [3200]" strokeweight="1pt">
                 <v:stroke startarrowwidth="narrow" startarrowlength="short" endarrowwidth="narrow" endarrowlength="short" miterlimit="5243f"/>
                 <v:textbox inset="2.53958mm,1.2694mm,2.53958mm,1.2694mm">
                   <w:txbxContent>
@@ -1394,30 +1402,34 @@
                     </w:p>
                   </w:txbxContent>
                 </v:textbox>
-                <w10:wrap type="square"/>
+                <w10:anchorlock/>
               </v:rect>
             </w:pict>
           </mc:Fallback>
         </mc:AlternateContent>
       </w:r>
+    </w:p>
+    <w:p>
+      <w:pPr>
+        <w:ind w:left="-450"/>
+        <w:rPr>
+          <w:rFonts w:ascii="Times New Roman" w:eastAsia="Times New Roman" w:hAnsi="Times New Roman" w:cs="Times New Roman"/>
+        </w:rPr>
+      </w:pPr>
       <w:r>
         <w:rPr>
           <w:rFonts w:ascii="Times New Roman" w:eastAsia="Times New Roman" w:hAnsi="Times New Roman" w:cs="Times New Roman"/>
           <w:b/>
           <w:bCs/>
         </w:rPr>
-        <w:t xml:space="preserve">Degree:  </w:t>
-      </w:r>
-    </w:p>
-    <w:p>
-      <w:pPr>
-        <w:ind w:left="-450"/>
-        <w:rPr>
-          <w:rFonts w:ascii="Times New Roman" w:eastAsia="Times New Roman" w:hAnsi="Times New Roman" w:cs="Times New Roman"/>
-          <w:b/>
-          <w:bCs/>
-        </w:rPr>
-      </w:pPr>
+        <w:t>School Year:</w:t>
+      </w:r>
+      <w:r>
+        <w:rPr>
+          <w:rFonts w:ascii="Times New Roman" w:eastAsia="Times New Roman" w:hAnsi="Times New Roman" w:cs="Times New Roman"/>
+        </w:rPr>
+        <w:t xml:space="preserve"> </w:t>
+      </w:r>
       <w:r>
         <w:rPr>
           <w:noProof/>
@@ -1425,17 +1437,9 @@
         <mc:AlternateContent>
           <mc:Choice Requires="wps">
             <w:drawing>
-              <wp:anchor distT="0" distB="0" distL="114300" distR="114300" simplePos="0" relativeHeight="251667456" behindDoc="0" locked="0" layoutInCell="1" allowOverlap="1" wp14:anchorId="10D7782F" wp14:editId="7363BF97">
-                <wp:simplePos x="0" y="0"/>
-                <wp:positionH relativeFrom="column">
-                  <wp:posOffset>662998</wp:posOffset>
-                </wp:positionH>
-                <wp:positionV relativeFrom="paragraph">
-                  <wp:posOffset>240962</wp:posOffset>
-                </wp:positionV>
+              <wp:inline distT="0" distB="0" distL="0" distR="0" wp14:anchorId="0002CB2A" wp14:editId="0638C1EF">
                 <wp:extent cx="1781175" cy="308610"/>
                 <wp:effectExtent l="0" t="0" r="28575" b="15240"/>
-                <wp:wrapSquare wrapText="bothSides"/>
                 <wp:docPr id="4" name="Rectangle 4"/>
                 <wp:cNvGraphicFramePr/>
                 <a:graphic xmlns:a="http://schemas.openxmlformats.org/drawingml/2006/main">
@@ -1538,12 +1542,12 @@
                     </wps:wsp>
                   </a:graphicData>
                 </a:graphic>
-              </wp:anchor>
+              </wp:inline>
             </w:drawing>
           </mc:Choice>
           <mc:Fallback>
             <w:pict>
-              <v:rect w14:anchorId="10D7782F" id="Rectangle 4" o:spid="_x0000_s1028" style="position:absolute;left:0;text-align:left;margin-left:52.2pt;margin-top:18.95pt;width:140.25pt;height:24.3pt;z-index:251667456;visibility:visible;mso-wrap-style:square;mso-wrap-distance-left:9pt;mso-wrap-distance-top:0;mso-wrap-distance-right:9pt;mso-wrap-distance-bottom:0;mso-position-horizontal:absolute;mso-position-horizontal-relative:text;mso-position-vertical:absolute;mso-position-vertical-relative:text;v-text-anchor:middle" o:gfxdata="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" fillcolor="white [3201]" strokecolor="black [3200]" strokeweight="1pt">
+              <v:rect w14:anchorId="0002CB2A" id="Rectangle 4" o:spid="_x0000_s1028" style="width:140.25pt;height:24.3pt;visibility:visible;mso-wrap-style:square;mso-left-percent:-10001;mso-top-percent:-10001;mso-position-horizontal:absolute;mso-position-horizontal-relative:char;mso-position-vertical:absolute;mso-position-vertical-relative:line;mso-left-percent:-10001;mso-top-percent:-10001;v-text-anchor:middle" o:gfxdata="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" fillcolor="white [3201]" strokecolor="black [3200]" strokeweight="1pt">
                 <v:stroke startarrowwidth="narrow" startarrowlength="short" endarrowwidth="narrow" endarrowlength="short" miterlimit="5243f"/>
                 <v:textbox inset="2.53958mm,1.2694mm,2.53958mm,1.2694mm">
                   <w:txbxContent>
@@ -1614,12 +1618,43 @@
                     </w:p>
                   </w:txbxContent>
                 </v:textbox>
-                <w10:wrap type="square"/>
+                <w10:anchorlock/>
               </v:rect>
             </w:pict>
           </mc:Fallback>
         </mc:AlternateContent>
       </w:r>
+      <w:proofErr w:type="gramStart"/>
+      <w:r>
+        <w:rPr>
+          <w:rFonts w:ascii="Times New Roman" w:eastAsia="Times New Roman" w:hAnsi="Times New Roman" w:cs="Times New Roman"/>
+        </w:rPr>
+        <w:tab/>
+        <w:t xml:space="preserve">  </w:t>
+      </w:r>
+      <w:r>
+        <w:rPr>
+          <w:rFonts w:ascii="Times New Roman" w:eastAsia="Times New Roman" w:hAnsi="Times New Roman" w:cs="Times New Roman"/>
+          <w:b/>
+          <w:bCs/>
+        </w:rPr>
+        <w:t>Term</w:t>
+      </w:r>
+      <w:proofErr w:type="gramEnd"/>
+      <w:r>
+        <w:rPr>
+          <w:rFonts w:ascii="Times New Roman" w:eastAsia="Times New Roman" w:hAnsi="Times New Roman" w:cs="Times New Roman"/>
+          <w:b/>
+          <w:bCs/>
+        </w:rPr>
+        <w:t>:</w:t>
+      </w:r>
+      <w:r>
+        <w:rPr>
+          <w:rFonts w:ascii="Times New Roman" w:eastAsia="Times New Roman" w:hAnsi="Times New Roman" w:cs="Times New Roman"/>
+        </w:rPr>
+        <w:t xml:space="preserve"> </w:t>
+      </w:r>
       <w:r>
         <w:rPr>
           <w:noProof/>
@@ -1627,17 +1662,9 @@
         <mc:AlternateContent>
           <mc:Choice Requires="wps">
             <w:drawing>
-              <wp:anchor distT="0" distB="0" distL="114300" distR="114300" simplePos="0" relativeHeight="251665408" behindDoc="0" locked="0" layoutInCell="1" hidden="0" allowOverlap="1" wp14:anchorId="5F0E0ACF" wp14:editId="79FD0962">
-                <wp:simplePos x="0" y="0"/>
-                <wp:positionH relativeFrom="column">
-                  <wp:posOffset>3407163</wp:posOffset>
-                </wp:positionH>
-                <wp:positionV relativeFrom="paragraph">
-                  <wp:posOffset>270634</wp:posOffset>
-                </wp:positionV>
-                <wp:extent cx="2738755" cy="266700"/>
-                <wp:effectExtent l="0" t="0" r="23495" b="19050"/>
-                <wp:wrapSquare wrapText="bothSides"/>
+              <wp:inline distT="0" distB="0" distL="0" distR="0" wp14:anchorId="47DE2416" wp14:editId="384A045A">
+                <wp:extent cx="2388358" cy="266700"/>
+                <wp:effectExtent l="0" t="0" r="12065" b="19050"/>
                 <wp:docPr id="5" name="Rectangle 5"/>
                 <wp:cNvGraphicFramePr/>
                 <a:graphic xmlns:a="http://schemas.openxmlformats.org/drawingml/2006/main">
@@ -1647,7 +1674,7 @@
                       <wps:spPr>
                         <a:xfrm>
                           <a:off x="0" y="0"/>
-                          <a:ext cx="2738755" cy="266700"/>
+                          <a:ext cx="2388358" cy="266700"/>
                         </a:xfrm>
                         <a:prstGeom prst="rect">
                           <a:avLst/>
@@ -1745,12 +1772,12 @@
                     </wps:wsp>
                   </a:graphicData>
                 </a:graphic>
-              </wp:anchor>
+              </wp:inline>
             </w:drawing>
           </mc:Choice>
           <mc:Fallback>
             <w:pict>
-              <v:rect w14:anchorId="5F0E0ACF" id="Rectangle 5" o:spid="_x0000_s1029" style="position:absolute;left:0;text-align:left;margin-left:268.3pt;margin-top:21.3pt;width:215.65pt;height:21pt;z-index:251665408;visibility:visible;mso-wrap-style:square;mso-wrap-distance-left:9pt;mso-wrap-distance-top:0;mso-wrap-distance-right:9pt;mso-wrap-distance-bottom:0;mso-position-horizontal:absolute;mso-position-horizontal-relative:text;mso-position-vertical:absolute;mso-position-vertical-relative:text;v-text-anchor:middle" o:gfxdata="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" fillcolor="white [3201]" strokecolor="black [3200]" strokeweight="1pt">
+              <v:rect w14:anchorId="47DE2416" id="Rectangle 5" o:spid="_x0000_s1029" style="width:188.05pt;height:21pt;visibility:visible;mso-wrap-style:square;mso-left-percent:-10001;mso-top-percent:-10001;mso-position-horizontal:absolute;mso-position-horizontal-relative:char;mso-position-vertical:absolute;mso-position-vertical-relative:line;mso-left-percent:-10001;mso-top-percent:-10001;v-text-anchor:middle" o:gfxdata="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" fillcolor="white [3201]" strokecolor="black [3200]" strokeweight="1pt">
                 <v:stroke startarrowwidth="narrow" startarrowlength="short" endarrowwidth="narrow" endarrowlength="short" miterlimit="5243f"/>
                 <v:textbox inset="2.53958mm,1.2694mm,2.53958mm,1.2694mm">
                   <w:txbxContent>
@@ -1826,54 +1853,11 @@
                     </w:p>
                   </w:txbxContent>
                 </v:textbox>
-                <w10:wrap type="square"/>
+                <w10:anchorlock/>
               </v:rect>
             </w:pict>
           </mc:Fallback>
         </mc:AlternateContent>
-      </w:r>
-    </w:p>
-    <w:p>
-      <w:pPr>
-        <w:ind w:left="-450"/>
-        <w:rPr>
-          <w:rFonts w:ascii="Times New Roman" w:eastAsia="Times New Roman" w:hAnsi="Times New Roman" w:cs="Times New Roman"/>
-        </w:rPr>
-      </w:pPr>
-      <w:r>
-        <w:rPr>
-          <w:rFonts w:ascii="Times New Roman" w:eastAsia="Times New Roman" w:hAnsi="Times New Roman" w:cs="Times New Roman"/>
-          <w:b/>
-          <w:bCs/>
-        </w:rPr>
-        <w:t>School Year:</w:t>
-      </w:r>
-      <w:r>
-        <w:rPr>
-          <w:rFonts w:ascii="Times New Roman" w:eastAsia="Times New Roman" w:hAnsi="Times New Roman" w:cs="Times New Roman"/>
-        </w:rPr>
-        <w:t xml:space="preserve"> </w:t>
-      </w:r>
-      <w:r>
-        <w:rPr>
-          <w:rFonts w:ascii="Times New Roman" w:eastAsia="Times New Roman" w:hAnsi="Times New Roman" w:cs="Times New Roman"/>
-        </w:rPr>
-        <w:tab/>
-        <w:t xml:space="preserve">    </w:t>
-      </w:r>
-      <w:r>
-        <w:rPr>
-          <w:rFonts w:ascii="Times New Roman" w:eastAsia="Times New Roman" w:hAnsi="Times New Roman" w:cs="Times New Roman"/>
-          <w:b/>
-          <w:bCs/>
-        </w:rPr>
-        <w:t>Term:</w:t>
-      </w:r>
-      <w:r>
-        <w:rPr>
-          <w:rFonts w:ascii="Times New Roman" w:eastAsia="Times New Roman" w:hAnsi="Times New Roman" w:cs="Times New Roman"/>
-        </w:rPr>
-        <w:t xml:space="preserve"> </w:t>
       </w:r>
     </w:p>
     <w:p>
@@ -1934,7 +1918,7 @@
               </wp:anchor>
             </w:drawing>
           </mc:Choice>
-          <mc:Fallback xmlns:sl="http://schemas.openxmlformats.org/schemaLibrary/2006/main" xmlns:a="http://schemas.openxmlformats.org/drawingml/2006/main" xmlns:pic="http://schemas.openxmlformats.org/drawingml/2006/picture" xmlns:c="http://schemas.openxmlformats.org/drawingml/2006/chart" xmlns:lc="http://schemas.openxmlformats.org/drawingml/2006/lockedCanvas" xmlns:dgm="http://schemas.openxmlformats.org/drawingml/2006/diagram" xmlns="http://schemas.microsoft.com/office/tasks/2019/documenttasks" xmlns:cr="http://schemas.microsoft.com/office/comments/2020/reactions">
+          <mc:Fallback xmlns:cr="http://schemas.microsoft.com/office/comments/2020/reactions" xmlns="http://schemas.microsoft.com/office/tasks/2019/documenttasks" xmlns:dgm="http://schemas.openxmlformats.org/drawingml/2006/diagram" xmlns:lc="http://schemas.openxmlformats.org/drawingml/2006/lockedCanvas" xmlns:c="http://schemas.openxmlformats.org/drawingml/2006/chart" xmlns:pic="http://schemas.openxmlformats.org/drawingml/2006/picture" xmlns:a="http://schemas.openxmlformats.org/drawingml/2006/main" xmlns:sl="http://schemas.openxmlformats.org/schemaLibrary/2006/main">
             <w:drawing>
               <wp:anchor allowOverlap="1" behindDoc="0" distB="0" distT="0" distL="114300" distR="114300" hidden="0" layoutInCell="1" locked="0" relativeHeight="0" simplePos="0">
                 <wp:simplePos x="0" y="0"/>
@@ -2763,7 +2747,7 @@
         <w:rPr>
           <w:rFonts w:ascii="Times New Roman" w:eastAsia="Times New Roman" w:hAnsi="Times New Roman" w:cs="Times New Roman"/>
         </w:rPr>
-        <w:t xml:space="preserve">                        </w:t>
+        <w:t xml:space="preserve">                       </w:t>
       </w:r>
       <w:proofErr w:type="gramStart"/>
       <w:r>
@@ -2982,13 +2966,21 @@
           <w:u w:val="single"/>
         </w:rPr>
       </w:pPr>
+      <w:proofErr w:type="gramStart"/>
       <w:r>
         <w:rPr>
           <w:rFonts w:ascii="Times New Roman" w:eastAsia="Times New Roman" w:hAnsi="Times New Roman" w:cs="Times New Roman"/>
           <w:u w:val="single"/>
         </w:rPr>
-        <w:lastRenderedPageBreak/>
-        <w:t xml:space="preserve">MR. HONIMAR </w:t>
+        <w:t>{{ sig</w:t>
+      </w:r>
+      <w:proofErr w:type="gramEnd"/>
+      <w:r>
+        <w:rPr>
+          <w:rFonts w:ascii="Times New Roman" w:eastAsia="Times New Roman" w:hAnsi="Times New Roman" w:cs="Times New Roman"/>
+          <w:u w:val="single"/>
+        </w:rPr>
+        <w:t>.professor_</w:t>
       </w:r>
       <w:proofErr w:type="gramStart"/>
       <w:r>
@@ -2996,7 +2988,7 @@
           <w:rFonts w:ascii="Times New Roman" w:eastAsia="Times New Roman" w:hAnsi="Times New Roman" w:cs="Times New Roman"/>
           <w:u w:val="single"/>
         </w:rPr>
-        <w:t>C.PANGANIBAN</w:t>
+        <w:t>name }</w:t>
       </w:r>
       <w:proofErr w:type="gramEnd"/>
       <w:r>
@@ -3004,7 +2996,7 @@
           <w:rFonts w:ascii="Times New Roman" w:eastAsia="Times New Roman" w:hAnsi="Times New Roman" w:cs="Times New Roman"/>
           <w:u w:val="single"/>
         </w:rPr>
-        <w:t xml:space="preserve">, MSIT   </w:t>
+        <w:t>}</w:t>
       </w:r>
     </w:p>
     <w:p>
@@ -3019,7 +3011,7 @@
         <w:rPr>
           <w:rFonts w:ascii="Times New Roman" w:eastAsia="Times New Roman" w:hAnsi="Times New Roman" w:cs="Times New Roman"/>
         </w:rPr>
-        <w:t xml:space="preserve">SOFTWARE ENGINEERING PROFESSOR  </w:t>
+        <w:t>{{ sig.professor_title }}</w:t>
       </w:r>
     </w:p>
     <w:p>

</xml_diff>